<commit_message>
Verify submission requirements and refine report layout and reproducibility
</commit_message>
<xml_diff>
--- a/lab04_prompt_program/report.docx
+++ b/lab04_prompt_program/report.docx
@@ -283,7 +283,7 @@
       <w:r>
         <w:fldChar w:fldCharType="separate"/>
       </w:r>
-      <w:hyperlink w:anchor="_Toc239784196" w:history="1">
+      <w:hyperlink w:anchor="_Toc239784367" w:history="1">
         <w:r>
           <w:rPr>
             <w:rStyle w:val="aff8"/>
@@ -311,7 +311,7 @@
             <w:noProof/>
             <w:webHidden/>
           </w:rPr>
-          <w:instrText xml:space="preserve"> PAGEREF _Toc239784196 \h </w:instrText>
+          <w:instrText xml:space="preserve"> PAGEREF _Toc239784367 \h </w:instrText>
         </w:r>
         <w:r>
           <w:rPr>
@@ -356,7 +356,7 @@
           <w:lang w:val="ru-RU" w:eastAsia="ru-RU"/>
         </w:rPr>
       </w:pPr>
-      <w:hyperlink w:anchor="_Toc239784197" w:history="1">
+      <w:hyperlink w:anchor="_Toc239784368" w:history="1">
         <w:r>
           <w:rPr>
             <w:rStyle w:val="aff8"/>
@@ -384,7 +384,7 @@
             <w:noProof/>
             <w:webHidden/>
           </w:rPr>
-          <w:instrText xml:space="preserve"> PAGEREF _Toc239784197 \h </w:instrText>
+          <w:instrText xml:space="preserve"> PAGEREF _Toc239784368 \h </w:instrText>
         </w:r>
         <w:r>
           <w:rPr>
@@ -429,7 +429,7 @@
           <w:lang w:val="ru-RU" w:eastAsia="ru-RU"/>
         </w:rPr>
       </w:pPr>
-      <w:hyperlink w:anchor="_Toc239784198" w:history="1">
+      <w:hyperlink w:anchor="_Toc239784369" w:history="1">
         <w:r>
           <w:rPr>
             <w:rStyle w:val="aff8"/>
@@ -457,7 +457,7 @@
             <w:noProof/>
             <w:webHidden/>
           </w:rPr>
-          <w:instrText xml:space="preserve"> PAGEREF _Toc239784198 \h </w:instrText>
+          <w:instrText xml:space="preserve"> PAGEREF _Toc239784369 \h </w:instrText>
         </w:r>
         <w:r>
           <w:rPr>
@@ -502,7 +502,7 @@
           <w:lang w:val="ru-RU" w:eastAsia="ru-RU"/>
         </w:rPr>
       </w:pPr>
-      <w:hyperlink w:anchor="_Toc239784199" w:history="1">
+      <w:hyperlink w:anchor="_Toc239784370" w:history="1">
         <w:r>
           <w:rPr>
             <w:rStyle w:val="aff8"/>
@@ -530,7 +530,7 @@
             <w:noProof/>
             <w:webHidden/>
           </w:rPr>
-          <w:instrText xml:space="preserve"> PAGEREF _Toc239784199 \h </w:instrText>
+          <w:instrText xml:space="preserve"> PAGEREF _Toc239784370 \h </w:instrText>
         </w:r>
         <w:r>
           <w:rPr>
@@ -575,7 +575,7 @@
           <w:lang w:val="ru-RU" w:eastAsia="ru-RU"/>
         </w:rPr>
       </w:pPr>
-      <w:hyperlink w:anchor="_Toc239784200" w:history="1">
+      <w:hyperlink w:anchor="_Toc239784371" w:history="1">
         <w:r>
           <w:rPr>
             <w:rStyle w:val="aff8"/>
@@ -603,7 +603,7 @@
             <w:noProof/>
             <w:webHidden/>
           </w:rPr>
-          <w:instrText xml:space="preserve"> PAGEREF _Toc239784200 \h </w:instrText>
+          <w:instrText xml:space="preserve"> PAGEREF _Toc239784371 \h </w:instrText>
         </w:r>
         <w:r>
           <w:rPr>
@@ -648,7 +648,7 @@
           <w:lang w:val="ru-RU" w:eastAsia="ru-RU"/>
         </w:rPr>
       </w:pPr>
-      <w:hyperlink w:anchor="_Toc239784201" w:history="1">
+      <w:hyperlink w:anchor="_Toc239784372" w:history="1">
         <w:r>
           <w:rPr>
             <w:rStyle w:val="aff8"/>
@@ -676,7 +676,7 @@
             <w:noProof/>
             <w:webHidden/>
           </w:rPr>
-          <w:instrText xml:space="preserve"> PAGEREF _Toc239784201 \h </w:instrText>
+          <w:instrText xml:space="preserve"> PAGEREF _Toc239784372 \h </w:instrText>
         </w:r>
         <w:r>
           <w:rPr>
@@ -721,7 +721,7 @@
           <w:lang w:val="ru-RU" w:eastAsia="ru-RU"/>
         </w:rPr>
       </w:pPr>
-      <w:hyperlink w:anchor="_Toc239784202" w:history="1">
+      <w:hyperlink w:anchor="_Toc239784373" w:history="1">
         <w:r>
           <w:rPr>
             <w:rStyle w:val="aff8"/>
@@ -749,7 +749,7 @@
             <w:noProof/>
             <w:webHidden/>
           </w:rPr>
-          <w:instrText xml:space="preserve"> PAGEREF _Toc239784202 \h </w:instrText>
+          <w:instrText xml:space="preserve"> PAGEREF _Toc239784373 \h </w:instrText>
         </w:r>
         <w:r>
           <w:rPr>
@@ -794,7 +794,7 @@
           <w:lang w:val="ru-RU" w:eastAsia="ru-RU"/>
         </w:rPr>
       </w:pPr>
-      <w:hyperlink w:anchor="_Toc239784203" w:history="1">
+      <w:hyperlink w:anchor="_Toc239784374" w:history="1">
         <w:r>
           <w:rPr>
             <w:rStyle w:val="aff8"/>
@@ -822,7 +822,7 @@
             <w:noProof/>
             <w:webHidden/>
           </w:rPr>
-          <w:instrText xml:space="preserve"> PAGEREF _Toc239784203 \h </w:instrText>
+          <w:instrText xml:space="preserve"> PAGEREF _Toc239784374 \h </w:instrText>
         </w:r>
         <w:r>
           <w:rPr>
@@ -867,7 +867,7 @@
           <w:lang w:val="ru-RU" w:eastAsia="ru-RU"/>
         </w:rPr>
       </w:pPr>
-      <w:hyperlink w:anchor="_Toc239784204" w:history="1">
+      <w:hyperlink w:anchor="_Toc239784375" w:history="1">
         <w:r>
           <w:rPr>
             <w:rStyle w:val="aff8"/>
@@ -895,7 +895,7 @@
             <w:noProof/>
             <w:webHidden/>
           </w:rPr>
-          <w:instrText xml:space="preserve"> PAGEREF _Toc239784204 \h </w:instrText>
+          <w:instrText xml:space="preserve"> PAGEREF _Toc239784375 \h </w:instrText>
         </w:r>
         <w:r>
           <w:rPr>
@@ -943,7 +943,7 @@
         <w:ind w:firstLine="0"/>
         <w:jc w:val="center"/>
       </w:pPr>
-      <w:bookmarkStart w:id="1" w:name="_Toc239784196"/>
+      <w:bookmarkStart w:id="1" w:name="_Toc239784367"/>
       <w:r>
         <w:lastRenderedPageBreak/>
         <w:t>ВВЕДЕНИЕ</w:t>
@@ -969,7 +969,7 @@
         <w:spacing w:after="240"/>
         <w:jc w:val="left"/>
       </w:pPr>
-      <w:bookmarkStart w:id="2" w:name="_Toc239784197"/>
+      <w:bookmarkStart w:id="2" w:name="_Toc239784368"/>
       <w:r>
         <w:lastRenderedPageBreak/>
         <w:t>1 Выполнение работы</w:t>
@@ -983,7 +983,7 @@
         <w:spacing w:before="240" w:after="240"/>
         <w:jc w:val="left"/>
       </w:pPr>
-      <w:bookmarkStart w:id="3" w:name="_Toc239784198"/>
+      <w:bookmarkStart w:id="3" w:name="_Toc239784369"/>
       <w:r>
         <w:t>1.1 Данные и эталон</w:t>
       </w:r>
@@ -1018,7 +1018,7 @@
         <w:spacing w:before="240" w:after="240"/>
         <w:jc w:val="left"/>
       </w:pPr>
-      <w:bookmarkStart w:id="4" w:name="_Toc239784199"/>
+      <w:bookmarkStart w:id="4" w:name="_Toc239784370"/>
       <w:r>
         <w:t>1.2 Реализация</w:t>
       </w:r>
@@ -1065,7 +1065,7 @@
         <w:spacing w:before="240" w:after="240"/>
         <w:jc w:val="left"/>
       </w:pPr>
-      <w:bookmarkStart w:id="5" w:name="_Toc239784200"/>
+      <w:bookmarkStart w:id="5" w:name="_Toc239784371"/>
       <w:r>
         <w:t>1.3 Проверка и метрики</w:t>
       </w:r>
@@ -1908,7 +1908,7 @@
         <w:spacing w:before="240" w:after="240"/>
         <w:jc w:val="left"/>
       </w:pPr>
-      <w:bookmarkStart w:id="6" w:name="_Toc239784201"/>
+      <w:bookmarkStart w:id="6" w:name="_Toc239784372"/>
       <w:r>
         <w:t>1.4 Анализ пяти ошибок</w:t>
       </w:r>
@@ -1977,7 +1977,7 @@
         <w:spacing w:before="240" w:after="240"/>
         <w:jc w:val="left"/>
       </w:pPr>
-      <w:bookmarkStart w:id="7" w:name="_Toc239784202"/>
+      <w:bookmarkStart w:id="7" w:name="_Toc239784373"/>
       <w:r>
         <w:t>1.5 Чувствительность к исправлениям эталона</w:t>
       </w:r>
@@ -2134,7 +2134,7 @@
                 <w:b/>
                 <w:sz w:val="20"/>
               </w:rPr>
-              <w:t>Precision альтернативного gold</w:t>
+              <w:t>Precision нового gold</w:t>
             </w:r>
           </w:p>
         </w:tc>
@@ -2153,7 +2153,7 @@
                 <w:b/>
                 <w:sz w:val="20"/>
               </w:rPr>
-              <w:t>Recall альтернативного gold</w:t>
+              <w:t>Recall нового gold</w:t>
             </w:r>
           </w:p>
         </w:tc>
@@ -2381,10 +2381,10 @@
     </w:p>
     <w:p>
       <w:r>
-        <w:t xml:space="preserve">Изменения малы и разнонаправленны; вывод о более высоком F1 version_2 </w:t>
+        <w:t xml:space="preserve">Изменения малы и разнонаправленны; вывод о более высоком F1 version_2 сохраняется. Однако </w:t>
       </w:r>
       <w:r>
-        <w:t>сохраняется. Однако аудит показывает, почему достоверность эталона нужно обсуждать отдельно от качества формального валидатора. Результаты и хеши опубликованы в results/sensitivity.json и results/sensitivity.csv; исходные предсказания не изменялись.</w:t>
+        <w:t>аудит показывает, почему достоверность эталона нужно обсуждать отдельно от качества формального валидатора. Результаты и хеши опубликованы в results/sensitivity.json и results/sensitivity.csv; исходные предсказания не изменялись.</w:t>
       </w:r>
     </w:p>
     <w:p>
@@ -2396,28 +2396,28 @@
         <w:ind w:firstLine="0"/>
         <w:jc w:val="center"/>
       </w:pPr>
-      <w:bookmarkStart w:id="8" w:name="_Toc239784203"/>
+      <w:bookmarkStart w:id="8" w:name="_Toc239784374"/>
       <w:r>
         <w:lastRenderedPageBreak/>
-        <w:t>ЗАКЛЮЧ</w:t>
-      </w:r>
-      <w:r>
-        <w:t>ЕНИЕ</w:t>
+        <w:t>ЗАКЛЮЧЕНИЕ</w:t>
       </w:r>
       <w:bookmarkEnd w:id="8"/>
     </w:p>
     <w:p>
       <w:r>
-        <w:t>В данном прогоне F1 вырос с 0,524 до 0,575, а число строк извлечений, отсутствующих в тексте, снизилось с 60 до 0. При этом итоговую валидацию прошли 45 из 50 ответов version_1 и 42 из 50 ответов version_2: более строгий контроль увеличил число отклон</w:t>
+        <w:t>В данном прогон</w:t>
       </w:r>
       <w:r>
-        <w:t>ений. Среднее время выросло с 6,62 до 7,65 с на отзыв. Программная оболочка обеспечивает воспроизводимый формат, видимый механизм исправления и контроль дословности. Полная формальная валидность не гарантирует правильного распределения информации между пол</w:t>
+        <w:t xml:space="preserve">е F1 вырос с 0,524 до 0,575, а число строк извлечений, отсутствующих в тексте, снизилось с 60 до 0. При этом итоговую валидацию прошли 45 из 50 ответов version_1 и 42 из 50 ответов version_2: более строгий контроль увеличил число отклонений. Среднее время </w:t>
       </w:r>
       <w:r>
-        <w:t>ями. У version_2 доля строк вне исходного текста контролируется конструктивно, но проверка evidence не доказывает причинность и не исключает неверной классификации настоящего фрагмента. Сравнивать версии следует одновременно по F1, повторам, времени и анал</w:t>
+        <w:t>выросло с 6,62 до 7,65 с на отзыв. Программная оболочка обеспечивает воспроизводимый формат, видимый механизм исправления и контроль дословности. Полная формальная валидность не гарантирует правильного распределения информации между полями. У version_2 дол</w:t>
       </w:r>
       <w:r>
-        <w:t>изу примеров. Эффект инструкции в этом исследовании ограничен одной моделью, одним прогоном, смещенной выборкой коротких отзывов и адаптированным ИИ-эталоном; независимая экспертная оценка остается необходимой для практического применения.</w:t>
+        <w:t>я строк вне исходного текста контролируется конструктивно, но проверка evidence не доказывает причинность и не исключает неверной классификации настоящего фрагмента. Сравнивать версии следует одновременно по F1, повторам, времени и анализу примеров. Эффект</w:t>
+      </w:r>
+      <w:r>
+        <w:t xml:space="preserve"> инструкции в этом исследовании ограничен одной моделью, одним прогоном, смещенной выборкой коротких отзывов и адаптированным ИИ-эталоном; независимая экспертная оценка остается необходимой для практического применения.</w:t>
       </w:r>
     </w:p>
     <w:p>
@@ -2429,22 +2429,22 @@
         <w:ind w:firstLine="0"/>
         <w:jc w:val="center"/>
       </w:pPr>
-      <w:bookmarkStart w:id="9" w:name="_Toc239784204"/>
+      <w:bookmarkStart w:id="9" w:name="_Toc239784375"/>
       <w:r>
         <w:lastRenderedPageBreak/>
-        <w:t>СПИСОК ИСПОЛЬЗОВ</w:t>
-      </w:r>
-      <w:r>
-        <w:t>АННЫХ ИСТОЧНИКОВ</w:t>
+        <w:t>СПИСОК ИСПОЛЬЗОВАННЫХ ИСТОЧНИКОВ</w:t>
       </w:r>
       <w:bookmarkEnd w:id="9"/>
     </w:p>
     <w:p>
       <w:r>
-        <w:t>1. Tutubalina E. et al. The Russian Drug Reaction Corpus and Neural Models for Drug Reactions and Effectiveness Detection in User Reviews // Bioinformatics. 2020. DOI: 10.1093/bioinformatics/btaa675. URL: https://github.com/cimm-kzn/RuDReC</w:t>
+        <w:t xml:space="preserve">1. </w:t>
       </w:r>
       <w:r>
-        <w:t xml:space="preserve"> (дата обращения: 08.09.2026).</w:t>
+        <w:t>Tutubalina E. et al. The Russian Drug Reaction Corpus and Neural Models for Drug Reactions and Effectiveness Detection in User Reviews // Bioinformatics. 2020. DOI: 10.1093/bioinformatics/btaa675. URL: https://github.com/cimm-kzn/RuDReC (дата обращения: 08</w:t>
+      </w:r>
+      <w:r>
+        <w:t>.09.2026).</w:t>
       </w:r>
     </w:p>
     <w:p>
@@ -2454,10 +2454,10 @@
     </w:p>
     <w:p>
       <w:r>
-        <w:t>README RuDReC называет корпус freely available; отдель</w:t>
+        <w:t>README RuDReC называет корпус freely available; отдельная стандартная лице</w:t>
       </w:r>
       <w:r>
-        <w:t>ная стандартная лицензия в корне источника не обнаружена. Данные не объявляются имеющими лицензию MIT или CC без подтверждения.</w:t>
+        <w:t>нзия в корне источника не обнаружена. Данные не объявляются имеющими лицензию MIT или CC без подтверждения.</w:t>
       </w:r>
     </w:p>
     <w:sectPr>
@@ -14517,7 +14517,7 @@
 </file>
 
 <file path=customXml/itemProps1.xml><?xml version="1.0" encoding="utf-8"?>
-<ds:datastoreItem xmlns:ds="http://schemas.openxmlformats.org/officeDocument/2006/customXml" ds:itemID="{F498A726-5B2C-422B-8CE6-816A4E74B4D8}">
+<ds:datastoreItem xmlns:ds="http://schemas.openxmlformats.org/officeDocument/2006/customXml" ds:itemID="{358EB4DC-7C27-4DCC-92E9-E9F27F8F579C}">
   <ds:schemaRefs>
     <ds:schemaRef ds:uri="http://schemas.openxmlformats.org/officeDocument/2006/bibliography"/>
   </ds:schemaRefs>

</xml_diff>